<commit_message>
chore: update agent source materials and ingestion scripts
</commit_message>
<xml_diff>
--- a/agentes/Ag. Dir. Trabalhista ok/Agentes Trabalhistas.docx
+++ b/agentes/Ag. Dir. Trabalhista ok/Agentes Trabalhistas.docx
@@ -44,7 +44,7 @@
           <w:highlight w:val="green"/>
           <w:rtl w:val="0"/>
         </w:rPr>
-        <w:t xml:space="preserve"> Agente DirTrab</w:t>
+        <w:t xml:space="preserve"> DirTrab</w:t>
       </w:r>
       <w:r>
         <w:rPr>
@@ -128,7 +128,7 @@
           <w:highlight w:val="green"/>
           <w:rtl w:val="0"/>
         </w:rPr>
-        <w:t xml:space="preserve">Agente AtosTr</w:t>
+        <w:t xml:space="preserve">AtosTr</w:t>
       </w:r>
     </w:p>
     <w:p>
@@ -199,7 +199,7 @@
           <w:highlight w:val="green"/>
           <w:rtl w:val="0"/>
         </w:rPr>
-        <w:t xml:space="preserve">Agente NR.s Pro </w:t>
+        <w:t xml:space="preserve">NR.s Pro </w:t>
       </w:r>
     </w:p>
     <w:p>
@@ -249,7 +249,7 @@
           <w:highlight w:val="green"/>
           <w:rtl w:val="0"/>
         </w:rPr>
-        <w:t xml:space="preserve">Agente SúmulasCore</w:t>
+        <w:t xml:space="preserve">Súmulas</w:t>
       </w:r>
       <w:r>
         <w:rPr>
@@ -301,7 +301,8 @@
           <w:highlight w:val="green"/>
           <w:rtl w:val="0"/>
         </w:rPr>
-        <w:t xml:space="preserve">5- Agente PrecedentX</w:t>
+        <w:t xml:space="preserve">5- Precedente</w:t>
+        <w:tab/>
       </w:r>
     </w:p>
     <w:p>
@@ -351,8 +352,8 @@
       <w:r>
         <w:rPr>
           <w:rFonts w:ascii="Arial" w:cs="Arial" w:eastAsia="Arial" w:hAnsi="Arial"/>
-          <w:b w:val="0"/>
-          <w:bCs w:val="0"/>
+          <w:b w:val="1"/>
+          <w:bCs w:val="1"/>
           <w:i w:val="0"/>
           <w:iCs w:val="0"/>
           <w:smallCaps w:val="0"/>
@@ -365,26 +366,20 @@
           <w:vertAlign w:val="baseline"/>
           <w:rtl w:val="0"/>
         </w:rPr>
-        <w:t xml:space="preserve">Agente </w:t>
+        <w:t xml:space="preserve">JurisPrud</w:t>
       </w:r>
       <w:r>
         <w:rPr>
           <w:rFonts w:ascii="Arial" w:cs="Arial" w:eastAsia="Arial" w:hAnsi="Arial"/>
           <w:b w:val="1"/>
           <w:bCs w:val="1"/>
-          <w:i w:val="0"/>
-          <w:iCs w:val="0"/>
-          <w:smallCaps w:val="0"/>
-          <w:strike w:val="0"/>
           <w:color w:val="ed7d31"/>
           <w:sz w:val="32"/>
           <w:szCs w:val="32"/>
           <w:highlight w:val="green"/>
-          <w:u w:val="none"/>
-          <w:vertAlign w:val="baseline"/>
-          <w:rtl w:val="0"/>
-        </w:rPr>
-        <w:t xml:space="preserve">JurisPrud </w:t>
+          <w:rtl w:val="0"/>
+        </w:rPr>
+        <w:t xml:space="preserve">ência</w:t>
       </w:r>
       <w:r>
         <w:rPr>
@@ -426,39 +421,10 @@
     </w:p>
     <w:p>
       <w:pPr>
-        <w:rPr>
-          <w:rFonts w:ascii="Courier" w:cs="Courier" w:eastAsia="Courier" w:hAnsi="Courier"/>
-          <w:b w:val="1"/>
-          <w:bCs w:val="1"/>
-          <w:color w:val="000000"/>
-          <w:highlight w:val="green"/>
-        </w:rPr>
-      </w:pPr>
-      <w:r>
-        <w:rPr>
-          <w:rtl w:val="0"/>
-        </w:rPr>
-      </w:r>
-    </w:p>
-    <w:p>
-      <w:pPr>
-        <w:rPr>
-          <w:rFonts w:ascii="Courier" w:cs="Courier" w:eastAsia="Courier" w:hAnsi="Courier"/>
-          <w:b w:val="1"/>
-          <w:bCs w:val="1"/>
-          <w:color w:val="000000"/>
-          <w:highlight w:val="green"/>
-        </w:rPr>
-      </w:pPr>
-      <w:r>
-        <w:rPr>
-          <w:rtl w:val="0"/>
-        </w:rPr>
-      </w:r>
-    </w:p>
-    <w:p>
-      <w:pPr>
-        <w:rPr>
+        <w:jc w:val="center"/>
+        <w:rPr>
+          <w:sz w:val="38"/>
+          <w:szCs w:val="38"/>
           <w:highlight w:val="green"/>
         </w:rPr>
       </w:pPr>
@@ -536,7 +502,7 @@
           <w:highlight w:val="green"/>
           <w:rtl w:val="0"/>
         </w:rPr>
-        <w:t xml:space="preserve">DirTrab - Agente Macro Direito Trabalhista</w:t>
+        <w:t xml:space="preserve">Agente Direito Trabalhista Macro</w:t>
       </w:r>
     </w:p>
     <w:p>
@@ -1087,15 +1053,26 @@
       <w:r>
         <w:rPr>
           <w:rFonts w:ascii="Arial" w:cs="Arial" w:eastAsia="Arial" w:hAnsi="Arial"/>
-          <w:b w:val="1"/>
-          <w:bCs w:val="1"/>
           <w:color w:val="ed7d31"/>
           <w:sz w:val="32"/>
           <w:szCs w:val="32"/>
           <w:highlight w:val="green"/>
           <w:rtl w:val="0"/>
         </w:rPr>
-        <w:t xml:space="preserve">Agente AtosLab</w:t>
+        <w:t xml:space="preserve">2-</w:t>
+      </w:r>
+      <w:r>
+        <w:rPr>
+          <w:rFonts w:ascii="Arial" w:cs="Arial" w:eastAsia="Arial" w:hAnsi="Arial"/>
+          <w:b w:val="1"/>
+          <w:bCs w:val="1"/>
+          <w:color w:val="ed7d31"/>
+          <w:sz w:val="32"/>
+          <w:szCs w:val="32"/>
+          <w:highlight w:val="green"/>
+          <w:rtl w:val="0"/>
+        </w:rPr>
+        <w:t xml:space="preserve">Atos Institucionais</w:t>
       </w:r>
     </w:p>
     <w:p>
@@ -1659,55 +1636,40 @@
     </w:p>
     <w:p>
       <w:pPr>
-        <w:keepNext w:val="0"/>
-        <w:keepLines w:val="0"/>
-        <w:pageBreakBefore w:val="0"/>
-        <w:widowControl w:val="1"/>
-        <w:pBdr>
-          <w:top w:space="0" w:sz="0" w:val="nil"/>
-          <w:left w:space="0" w:sz="0" w:val="nil"/>
-          <w:bottom w:space="0" w:sz="0" w:val="nil"/>
-          <w:right w:space="0" w:sz="0" w:val="nil"/>
-          <w:between w:space="0" w:sz="0" w:val="nil"/>
-        </w:pBdr>
-        <w:shd w:fill="auto" w:val="clear"/>
-        <w:spacing w:after="0" w:before="280" w:line="240" w:lineRule="auto"/>
-        <w:ind w:left="0" w:right="0" w:firstLine="0"/>
-        <w:jc w:val="left"/>
+        <w:spacing w:after="0" w:line="240" w:lineRule="auto"/>
         <w:rPr>
           <w:rFonts w:ascii="Arial" w:cs="Arial" w:eastAsia="Arial" w:hAnsi="Arial"/>
           <w:b w:val="1"/>
           <w:bCs w:val="1"/>
-          <w:i w:val="0"/>
-          <w:iCs w:val="0"/>
-          <w:smallCaps w:val="0"/>
-          <w:strike w:val="0"/>
           <w:color w:val="ed7d31"/>
           <w:sz w:val="32"/>
           <w:szCs w:val="32"/>
           <w:highlight w:val="green"/>
-          <w:u w:val="none"/>
-          <w:vertAlign w:val="baseline"/>
         </w:rPr>
       </w:pPr>
       <w:r>
         <w:rPr>
           <w:rFonts w:ascii="Arial" w:cs="Arial" w:eastAsia="Arial" w:hAnsi="Arial"/>
-          <w:b w:val="1"/>
-          <w:bCs w:val="1"/>
-          <w:i w:val="0"/>
-          <w:iCs w:val="0"/>
-          <w:smallCaps w:val="0"/>
-          <w:strike w:val="0"/>
           <w:color w:val="ed7d31"/>
           <w:sz w:val="32"/>
           <w:szCs w:val="32"/>
           <w:highlight w:val="green"/>
-          <w:u w:val="none"/>
-          <w:vertAlign w:val="baseline"/>
-          <w:rtl w:val="0"/>
-        </w:rPr>
-        <w:t xml:space="preserve">Agente NR.sPro </w:t>
+          <w:rtl w:val="0"/>
+        </w:rPr>
+        <w:t xml:space="preserve">3- </w:t>
+      </w:r>
+      <w:r>
+        <w:rPr>
+          <w:rFonts w:ascii="Arial" w:cs="Arial" w:eastAsia="Arial" w:hAnsi="Arial"/>
+          <w:b w:val="1"/>
+          <w:bCs w:val="1"/>
+          <w:color w:val="ed7d31"/>
+          <w:sz w:val="32"/>
+          <w:szCs w:val="32"/>
+          <w:highlight w:val="green"/>
+          <w:rtl w:val="0"/>
+        </w:rPr>
+        <w:t xml:space="preserve">NR.s - Normas Regulamentadores</w:t>
       </w:r>
     </w:p>
     <w:p>
@@ -9327,27 +9289,9 @@
     </w:p>
     <w:p>
       <w:pPr>
+        <w:spacing w:after="0" w:line="240" w:lineRule="auto"/>
         <w:rPr>
           <w:rFonts w:ascii="Arial" w:cs="Arial" w:eastAsia="Arial" w:hAnsi="Arial"/>
-          <w:b w:val="1"/>
-          <w:bCs w:val="1"/>
-          <w:sz w:val="32"/>
-          <w:szCs w:val="32"/>
-          <w:highlight w:val="green"/>
-        </w:rPr>
-      </w:pPr>
-      <w:r>
-        <w:rPr>
-          <w:rtl w:val="0"/>
-        </w:rPr>
-      </w:r>
-    </w:p>
-    <w:p>
-      <w:pPr>
-        <w:rPr>
-          <w:rFonts w:ascii="Arial" w:cs="Arial" w:eastAsia="Arial" w:hAnsi="Arial"/>
-          <w:b w:val="1"/>
-          <w:bCs w:val="1"/>
           <w:color w:val="ed7d31"/>
           <w:sz w:val="32"/>
           <w:szCs w:val="32"/>
@@ -9357,15 +9301,37 @@
       <w:r>
         <w:rPr>
           <w:rFonts w:ascii="Arial" w:cs="Arial" w:eastAsia="Arial" w:hAnsi="Arial"/>
-          <w:b w:val="1"/>
-          <w:bCs w:val="1"/>
           <w:color w:val="ed7d31"/>
           <w:sz w:val="32"/>
           <w:szCs w:val="32"/>
           <w:highlight w:val="green"/>
           <w:rtl w:val="0"/>
         </w:rPr>
-        <w:t xml:space="preserve">Agente SúmulasCore</w:t>
+        <w:t xml:space="preserve">4- </w:t>
+      </w:r>
+      <w:r>
+        <w:rPr>
+          <w:rFonts w:ascii="Arial" w:cs="Arial" w:eastAsia="Arial" w:hAnsi="Arial"/>
+          <w:b w:val="1"/>
+          <w:bCs w:val="1"/>
+          <w:color w:val="ed7d31"/>
+          <w:sz w:val="32"/>
+          <w:szCs w:val="32"/>
+          <w:highlight w:val="green"/>
+          <w:rtl w:val="0"/>
+        </w:rPr>
+        <w:t xml:space="preserve">Súmulas</w:t>
+      </w:r>
+      <w:r>
+        <w:rPr>
+          <w:rFonts w:ascii="Arial" w:cs="Arial" w:eastAsia="Arial" w:hAnsi="Arial"/>
+          <w:color w:val="ed7d31"/>
+          <w:sz w:val="32"/>
+          <w:szCs w:val="32"/>
+          <w:highlight w:val="green"/>
+          <w:rtl w:val="0"/>
+        </w:rPr>
+        <w:t xml:space="preserve"> </w:t>
       </w:r>
     </w:p>
     <w:p>
@@ -10452,6 +10418,123 @@
     </w:p>
     <w:p>
       <w:pPr>
+        <w:spacing w:after="0" w:line="240" w:lineRule="auto"/>
+        <w:rPr>
+          <w:rFonts w:ascii="Arial" w:cs="Arial" w:eastAsia="Arial" w:hAnsi="Arial"/>
+          <w:b w:val="1"/>
+          <w:bCs w:val="1"/>
+          <w:color w:val="ed7d31"/>
+          <w:sz w:val="32"/>
+          <w:szCs w:val="32"/>
+          <w:highlight w:val="green"/>
+        </w:rPr>
+      </w:pPr>
+      <w:r>
+        <w:rPr>
+          <w:rFonts w:ascii="Arial" w:cs="Arial" w:eastAsia="Arial" w:hAnsi="Arial"/>
+          <w:b w:val="1"/>
+          <w:bCs w:val="1"/>
+          <w:color w:val="ed7d31"/>
+          <w:sz w:val="32"/>
+          <w:szCs w:val="32"/>
+          <w:highlight w:val="green"/>
+          <w:rtl w:val="0"/>
+        </w:rPr>
+        <w:t xml:space="preserve">5- Precedente</w:t>
+        <w:tab/>
+      </w:r>
+    </w:p>
+    <w:p>
+      <w:pPr>
+        <w:spacing w:after="0" w:line="240" w:lineRule="auto"/>
+        <w:rPr>
+          <w:rFonts w:ascii="Times New Roman" w:cs="Times New Roman" w:eastAsia="Times New Roman" w:hAnsi="Times New Roman"/>
+          <w:sz w:val="24"/>
+          <w:szCs w:val="24"/>
+          <w:highlight w:val="green"/>
+        </w:rPr>
+      </w:pPr>
+      <w:r>
+        <w:rPr>
+          <w:rFonts w:ascii="Times New Roman" w:cs="Times New Roman" w:eastAsia="Times New Roman" w:hAnsi="Times New Roman"/>
+          <w:sz w:val="24"/>
+          <w:szCs w:val="24"/>
+          <w:highlight w:val="green"/>
+          <w:rtl w:val="0"/>
+        </w:rPr>
+        <w:t xml:space="preserve">Ele destaca decisões vinculantes, repetitivas e entendimentos com força persuasiva relevante.</w:t>
+      </w:r>
+    </w:p>
+    <w:p>
+      <w:pPr>
+        <w:spacing w:after="0" w:line="240" w:lineRule="auto"/>
+        <w:rPr>
+          <w:rFonts w:ascii="Times New Roman" w:cs="Times New Roman" w:eastAsia="Times New Roman" w:hAnsi="Times New Roman"/>
+          <w:sz w:val="24"/>
+          <w:szCs w:val="24"/>
+          <w:highlight w:val="green"/>
+        </w:rPr>
+      </w:pPr>
+      <w:r>
+        <w:rPr>
+          <w:rFonts w:ascii="Times New Roman" w:cs="Times New Roman" w:eastAsia="Times New Roman" w:hAnsi="Times New Roman"/>
+          <w:sz w:val="24"/>
+          <w:szCs w:val="24"/>
+          <w:highlight w:val="green"/>
+          <w:rtl w:val="0"/>
+        </w:rPr>
+        <w:t xml:space="preserve">Entrega direcionamento estratégico para fundamentações consistentes e alinhadas à orientação dos tribunais.</w:t>
+      </w:r>
+    </w:p>
+    <w:p>
+      <w:pPr>
+        <w:rPr>
+          <w:highlight w:val="green"/>
+        </w:rPr>
+      </w:pPr>
+      <w:hyperlink r:id="rId137">
+        <w:r>
+          <w:rPr>
+            <w:color w:val="1155cc"/>
+            <w:highlight w:val="green"/>
+            <w:u w:val="single"/>
+            <w:rtl w:val="0"/>
+          </w:rPr>
+          <w:t xml:space="preserve">https://www.tst.jus.br/nugep-sp/recursos-repetitivos/precedentes-vinculantes</w:t>
+        </w:r>
+      </w:hyperlink>
+      <w:r>
+        <w:rPr>
+          <w:rtl w:val="0"/>
+        </w:rPr>
+      </w:r>
+    </w:p>
+    <w:p>
+      <w:pPr>
+        <w:rPr>
+          <w:highlight w:val="green"/>
+        </w:rPr>
+      </w:pPr>
+      <w:r>
+        <w:rPr>
+          <w:rtl w:val="0"/>
+        </w:rPr>
+      </w:r>
+    </w:p>
+    <w:p>
+      <w:pPr>
+        <w:rPr>
+          <w:highlight w:val="green"/>
+        </w:rPr>
+      </w:pPr>
+      <w:r>
+        <w:rPr>
+          <w:rtl w:val="0"/>
+        </w:rPr>
+      </w:r>
+    </w:p>
+    <w:p>
+      <w:pPr>
         <w:rPr>
           <w:rFonts w:ascii="Arial" w:cs="Arial" w:eastAsia="Arial" w:hAnsi="Arial"/>
           <w:b w:val="1"/>
@@ -10473,120 +10556,7 @@
           <w:highlight w:val="green"/>
           <w:rtl w:val="0"/>
         </w:rPr>
-        <w:t xml:space="preserve">Agente PrecedentX</w:t>
-      </w:r>
-    </w:p>
-    <w:p>
-      <w:pPr>
-        <w:spacing w:after="0" w:line="240" w:lineRule="auto"/>
-        <w:rPr>
-          <w:rFonts w:ascii="Times New Roman" w:cs="Times New Roman" w:eastAsia="Times New Roman" w:hAnsi="Times New Roman"/>
-          <w:sz w:val="24"/>
-          <w:szCs w:val="24"/>
-          <w:highlight w:val="green"/>
-        </w:rPr>
-      </w:pPr>
-      <w:r>
-        <w:rPr>
-          <w:rFonts w:ascii="Times New Roman" w:cs="Times New Roman" w:eastAsia="Times New Roman" w:hAnsi="Times New Roman"/>
-          <w:sz w:val="24"/>
-          <w:szCs w:val="24"/>
-          <w:highlight w:val="green"/>
-          <w:rtl w:val="0"/>
-        </w:rPr>
-        <w:t xml:space="preserve">Ele destaca decisões vinculantes, repetitivas e entendimentos com força persuasiva relevante.</w:t>
-      </w:r>
-    </w:p>
-    <w:p>
-      <w:pPr>
-        <w:spacing w:after="0" w:line="240" w:lineRule="auto"/>
-        <w:rPr>
-          <w:rFonts w:ascii="Times New Roman" w:cs="Times New Roman" w:eastAsia="Times New Roman" w:hAnsi="Times New Roman"/>
-          <w:sz w:val="24"/>
-          <w:szCs w:val="24"/>
-          <w:highlight w:val="green"/>
-        </w:rPr>
-      </w:pPr>
-      <w:r>
-        <w:rPr>
-          <w:rFonts w:ascii="Times New Roman" w:cs="Times New Roman" w:eastAsia="Times New Roman" w:hAnsi="Times New Roman"/>
-          <w:sz w:val="24"/>
-          <w:szCs w:val="24"/>
-          <w:highlight w:val="green"/>
-          <w:rtl w:val="0"/>
-        </w:rPr>
-        <w:t xml:space="preserve">Entrega direcionamento estratégico para fundamentações consistentes e alinhadas à orientação dos tribunais.</w:t>
-      </w:r>
-    </w:p>
-    <w:p>
-      <w:pPr>
-        <w:rPr>
-          <w:highlight w:val="green"/>
-        </w:rPr>
-      </w:pPr>
-      <w:hyperlink r:id="rId137">
-        <w:r>
-          <w:rPr>
-            <w:color w:val="1155cc"/>
-            <w:highlight w:val="green"/>
-            <w:u w:val="single"/>
-            <w:rtl w:val="0"/>
-          </w:rPr>
-          <w:t xml:space="preserve">https://www.tst.jus.br/nugep-sp/recursos-repetitivos/precedentes-vinculantes</w:t>
-        </w:r>
-      </w:hyperlink>
-      <w:r>
-        <w:rPr>
-          <w:rtl w:val="0"/>
-        </w:rPr>
-      </w:r>
-    </w:p>
-    <w:p>
-      <w:pPr>
-        <w:rPr>
-          <w:highlight w:val="green"/>
-        </w:rPr>
-      </w:pPr>
-      <w:r>
-        <w:rPr>
-          <w:rtl w:val="0"/>
-        </w:rPr>
-      </w:r>
-    </w:p>
-    <w:p>
-      <w:pPr>
-        <w:rPr>
-          <w:highlight w:val="green"/>
-        </w:rPr>
-      </w:pPr>
-      <w:r>
-        <w:rPr>
-          <w:rtl w:val="0"/>
-        </w:rPr>
-      </w:r>
-    </w:p>
-    <w:p>
-      <w:pPr>
-        <w:rPr>
-          <w:b w:val="1"/>
-          <w:bCs w:val="1"/>
-          <w:color w:val="ff9900"/>
-          <w:sz w:val="32"/>
-          <w:szCs w:val="32"/>
-          <w:highlight w:val="green"/>
-        </w:rPr>
-      </w:pPr>
-      <w:r>
-        <w:rPr>
-          <w:b w:val="1"/>
-          <w:bCs w:val="1"/>
-          <w:color w:val="ff9900"/>
-          <w:sz w:val="32"/>
-          <w:szCs w:val="32"/>
-          <w:highlight w:val="green"/>
-          <w:rtl w:val="0"/>
-        </w:rPr>
-        <w:t xml:space="preserve">Agente JurisPrud </w:t>
+        <w:t xml:space="preserve">6- JurisPrudência </w:t>
       </w:r>
     </w:p>
     <w:p>

</xml_diff>